<commit_message>
docs: append dialectics article summary
Co-authored-by: 36613453226Wallen <36613453226Wallen@users.noreply.github.com>
</commit_message>
<xml_diff>
--- a/files/YaoZHIhu/姚勇文章目录/2辩证法解释一切与废话？从联系、矛盾到实践.docx
+++ b/files/YaoZHIhu/姚勇文章目录/2辩证法解释一切与废话？从联系、矛盾到实践.docx
@@ -2374,6 +2374,220 @@
           <w:sz w:val="20"/>
         </w:rPr>
         <w:t>https://www.zhihu.com/question/1980013147407545849/answer/1981201398533226606</w:t>
+      </w:r>
+    </w:p>
+    <w:p>
+      <w:pPr>
+        <w:spacing w:before="280" w:after="80"/>
+        <w:pBdr>
+          <w:top w:val="single" w:sz="8" w:space="8" w:color="7F8FA6"/>
+        </w:pBdr>
+      </w:pPr>
+      <w:r>
+        <w:rPr>
+          <w:rFonts w:ascii="微软雅黑" w:hAnsi="微软雅黑" w:eastAsia="微软雅黑"/>
+          <w:b/>
+          <w:color w:val="2D4C6E"/>
+          <w:sz w:val="26"/>
+        </w:rPr>
+        <w:t>附：内容概要（AI整理，非姚勇原文）</w:t>
+      </w:r>
+    </w:p>
+    <w:p>
+      <w:pPr>
+        <w:spacing w:before="100" w:after="20"/>
+      </w:pPr>
+      <w:r>
+        <w:rPr>
+          <w:rFonts w:ascii="微软雅黑" w:hAnsi="微软雅黑" w:eastAsia="微软雅黑"/>
+          <w:b/>
+          <w:color w:val="374B5F"/>
+          <w:sz w:val="21"/>
+        </w:rPr>
+        <w:t>1. 辩证法本身不是问题</w:t>
+      </w:r>
+    </w:p>
+    <w:p>
+      <w:pPr>
+        <w:spacing w:before="0" w:after="60" w:line="276" w:lineRule="auto"/>
+        <w:ind w:left="288"/>
+      </w:pPr>
+      <w:r>
+        <w:rPr>
+          <w:rFonts w:ascii="仿宋" w:hAnsi="仿宋" w:eastAsia="仿宋"/>
+          <w:b w:val="0"/>
+          <w:color w:val="414141"/>
+          <w:sz w:val="21"/>
+        </w:rPr>
+        <w:t>姚勇认为，辩证法只是处理长期、复杂事物的宏观工具。真正令人反感的是它被权力包装成不可质疑的话术。</w:t>
+      </w:r>
+    </w:p>
+    <w:p>
+      <w:pPr>
+        <w:spacing w:before="100" w:after="20"/>
+      </w:pPr>
+      <w:r>
+        <w:rPr>
+          <w:rFonts w:ascii="微软雅黑" w:hAnsi="微软雅黑" w:eastAsia="微软雅黑"/>
+          <w:b/>
+          <w:color w:val="374B5F"/>
+          <w:sz w:val="21"/>
+        </w:rPr>
+        <w:t>2. 问题在于前提和逻辑</w:t>
+      </w:r>
+    </w:p>
+    <w:p>
+      <w:pPr>
+        <w:spacing w:before="0" w:after="60" w:line="276" w:lineRule="auto"/>
+        <w:ind w:left="288"/>
+      </w:pPr>
+      <w:r>
+        <w:rPr>
+          <w:rFonts w:ascii="仿宋" w:hAnsi="仿宋" w:eastAsia="仿宋"/>
+          <w:b w:val="0"/>
+          <w:color w:val="414141"/>
+          <w:sz w:val="21"/>
+        </w:rPr>
+        <w:t>如果前提、定义、条件和事实被偷换，同一框架可以推出完全相反的结论。作者建议用逻辑和AI识别谬误，但“AI能解决辨谬”说得偏乐观，AI本身也会误判。</w:t>
+      </w:r>
+    </w:p>
+    <w:p>
+      <w:pPr>
+        <w:spacing w:before="100" w:after="20"/>
+      </w:pPr>
+      <w:r>
+        <w:rPr>
+          <w:rFonts w:ascii="微软雅黑" w:hAnsi="微软雅黑" w:eastAsia="微软雅黑"/>
+          <w:b/>
+          <w:color w:val="374B5F"/>
+          <w:sz w:val="21"/>
+        </w:rPr>
+        <w:t>3. 个人转行案例</w:t>
+      </w:r>
+    </w:p>
+    <w:p>
+      <w:pPr>
+        <w:spacing w:before="0" w:after="60" w:line="276" w:lineRule="auto"/>
+        <w:ind w:left="288"/>
+      </w:pPr>
+      <w:r>
+        <w:rPr>
+          <w:rFonts w:ascii="仿宋" w:hAnsi="仿宋" w:eastAsia="仿宋"/>
+          <w:b w:val="0"/>
+          <w:color w:val="414141"/>
+          <w:sz w:val="21"/>
+        </w:rPr>
+        <w:t>不要把“辞职或不辞职”看成孤立二选一，而应检查能力、行业、储蓄、家庭和岗位需求。通过学习、小项目、兼职逐步量变，达到条件后再转行。</w:t>
+      </w:r>
+    </w:p>
+    <w:p>
+      <w:pPr>
+        <w:spacing w:before="100" w:after="20"/>
+      </w:pPr>
+      <w:r>
+        <w:rPr>
+          <w:rFonts w:ascii="微软雅黑" w:hAnsi="微软雅黑" w:eastAsia="微软雅黑"/>
+          <w:b/>
+          <w:color w:val="374B5F"/>
+          <w:sz w:val="21"/>
+        </w:rPr>
+        <w:t>4. 企业数字化案例</w:t>
+      </w:r>
+    </w:p>
+    <w:p>
+      <w:pPr>
+        <w:spacing w:before="0" w:after="60" w:line="276" w:lineRule="auto"/>
+        <w:ind w:left="288"/>
+      </w:pPr>
+      <w:r>
+        <w:rPr>
+          <w:rFonts w:ascii="仿宋" w:hAnsi="仿宋" w:eastAsia="仿宋"/>
+          <w:b w:val="0"/>
+          <w:color w:val="414141"/>
+          <w:sz w:val="21"/>
+        </w:rPr>
+        <w:t>小工厂不应因为流行而盲目数字化。先找主要矛盾，如良品率、交期或库存，再以单条产线试点，根据数据逐步扩大。</w:t>
+      </w:r>
+    </w:p>
+    <w:p>
+      <w:pPr>
+        <w:spacing w:before="100" w:after="20"/>
+      </w:pPr>
+      <w:r>
+        <w:rPr>
+          <w:rFonts w:ascii="微软雅黑" w:hAnsi="微软雅黑" w:eastAsia="微软雅黑"/>
+          <w:b/>
+          <w:color w:val="374B5F"/>
+          <w:sz w:val="21"/>
+        </w:rPr>
+        <w:t>5. 房价、婚育与人口案例</w:t>
+      </w:r>
+    </w:p>
+    <w:p>
+      <w:pPr>
+        <w:spacing w:before="0" w:after="60" w:line="276" w:lineRule="auto"/>
+        <w:ind w:left="288"/>
+      </w:pPr>
+      <w:r>
+        <w:rPr>
+          <w:rFonts w:ascii="仿宋" w:hAnsi="仿宋" w:eastAsia="仿宋"/>
+          <w:b w:val="0"/>
+          <w:color w:val="414141"/>
+          <w:sz w:val="21"/>
+        </w:rPr>
+        <w:t>房价只是复杂系统的一部分，还涉及土地财政、就业、教育、托育、女性职业成本和城市资源。解决方案必须多线配合，不能寻找单一罪魁祸首。</w:t>
+      </w:r>
+    </w:p>
+    <w:p>
+      <w:pPr>
+        <w:spacing w:before="100" w:after="20"/>
+      </w:pPr>
+      <w:r>
+        <w:rPr>
+          <w:rFonts w:ascii="微软雅黑" w:hAnsi="微软雅黑" w:eastAsia="微软雅黑"/>
+          <w:b/>
+          <w:color w:val="374B5F"/>
+          <w:sz w:val="21"/>
+        </w:rPr>
+        <w:t>6. 统一方法</w:t>
+      </w:r>
+    </w:p>
+    <w:p>
+      <w:pPr>
+        <w:spacing w:before="0" w:after="60" w:line="276" w:lineRule="auto"/>
+        <w:ind w:left="288"/>
+      </w:pPr>
+      <w:r>
+        <w:rPr>
+          <w:rFonts w:ascii="仿宋" w:hAnsi="仿宋" w:eastAsia="仿宋"/>
+          <w:b w:val="0"/>
+          <w:color w:val="414141"/>
+          <w:sz w:val="21"/>
+        </w:rPr>
+        <w:t>全文最终归纳为：把问题放回整体联系；找主要矛盾及主要方面；从发展阶段观察变化；通过小步实践反复修正；依靠量变积累产生质变。</w:t>
+      </w:r>
+    </w:p>
+    <w:p>
+      <w:pPr>
+        <w:spacing w:before="120" w:after="0" w:line="276" w:lineRule="auto"/>
+      </w:pPr>
+      <w:r>
+        <w:rPr>
+          <w:rFonts w:ascii="微软雅黑" w:hAnsi="微软雅黑" w:eastAsia="微软雅黑"/>
+          <w:b/>
+          <w:color w:val="5A462D"/>
+          <w:sz w:val="21"/>
+        </w:rPr>
+        <w:t>判断补充：</w:t>
+      </w:r>
+      <w:r>
+        <w:rPr>
+          <w:rFonts w:ascii="仿宋" w:hAnsi="仿宋" w:eastAsia="仿宋"/>
+          <w:b w:val="0"/>
+          <w:color w:val="4B4B4B"/>
+          <w:sz w:val="21"/>
+        </w:rPr>
+        <w:t>严格说，这些案例同时混合了系统思维、逻辑分析和“小步试验”，不全是辩证法独有的方法。因此采用疑问式标题更准确，也保留了对“什么都能解释，可能也意味着什么都没有被有效区分”的质疑。</w:t>
       </w:r>
     </w:p>
     <w:sectPr>

</xml_diff>